<commit_message>
Update milestone logic with project entity
</commit_message>
<xml_diff>
--- a/LyMinhHoang-K25DTCN224.docx
+++ b/LyMinhHoang-K25DTCN224.docx
@@ -2573,54 +2573,7 @@
         <w:rPr/>
       </w:pPr>
       <w:r>
-        <w:rPr>
-          <w:rFonts w:ascii="Times New Roman" w:cs="Times New Roman" w:eastAsia="Times New Roman" w:hAnsi="Times New Roman"/>
-          <w:b w:val="0"/>
-          <w:bCs w:val="0"/>
-          <w:i w:val="0"/>
-          <w:iCs w:val="0"/>
-          <w:smallCaps w:val="0"/>
-          <w:strike w:val="0"/>
-          <w:color w:val="000000"/>
-          <w:sz w:val="22"/>
-          <w:szCs w:val="22"/>
-          <w:u w:val="none"/>
-          <w:shd w:fill="auto" w:val="clear"/>
-          <w:vertAlign w:val="baseline"/>
-          <w:rtl w:val="0"/>
-        </w:rPr>
-        <w:t xml:space="preserve">Máy Windows đã cài XAMPP </w:t>
-      </w:r>
-      <w:r>
-        <w:rPr>
-          <w:rFonts w:ascii="Times New Roman" w:cs="Times New Roman" w:eastAsia="Times New Roman" w:hAnsi="Times New Roman"/>
-          <w:rtl w:val="0"/>
-        </w:rPr>
-        <w:t xml:space="preserve">hoặc đã có mysql tại local</w:t>
-      </w:r>
-      <w:r>
-        <w:rPr>
-          <w:rFonts w:ascii="Times New Roman" w:cs="Times New Roman" w:eastAsia="Times New Roman" w:hAnsi="Times New Roman"/>
-          <w:b w:val="0"/>
-          <w:bCs w:val="0"/>
-          <w:i w:val="0"/>
-          <w:iCs w:val="0"/>
-          <w:smallCaps w:val="0"/>
-          <w:strike w:val="0"/>
-          <w:color w:val="000000"/>
-          <w:sz w:val="22"/>
-          <w:szCs w:val="22"/>
-          <w:u w:val="none"/>
-          <w:shd w:fill="auto" w:val="clear"/>
-          <w:vertAlign w:val="baseline"/>
-          <w:rtl w:val="0"/>
-        </w:rPr>
-        <w:t xml:space="preserve">.</w:t>
-      </w:r>
-      <w:r>
-        <w:rPr>
-          <w:rtl w:val="0"/>
-        </w:rPr>
+        <w:t>Máy Windows đã cài XAMPP.</w:t>
       </w:r>
     </w:p>
     <w:p>
@@ -2647,54 +2600,7 @@
         <w:rPr/>
       </w:pPr>
       <w:r>
-        <w:rPr>
-          <w:rFonts w:ascii="Times New Roman" w:cs="Times New Roman" w:eastAsia="Times New Roman" w:hAnsi="Times New Roman"/>
-          <w:b w:val="0"/>
-          <w:bCs w:val="0"/>
-          <w:i w:val="0"/>
-          <w:iCs w:val="0"/>
-          <w:smallCaps w:val="0"/>
-          <w:strike w:val="0"/>
-          <w:color w:val="000000"/>
-          <w:sz w:val="22"/>
-          <w:szCs w:val="22"/>
-          <w:u w:val="none"/>
-          <w:shd w:fill="auto" w:val="clear"/>
-          <w:vertAlign w:val="baseline"/>
-          <w:rtl w:val="0"/>
-        </w:rPr>
-        <w:t xml:space="preserve">Dịch vụ MySQL trong XAMPP đang chạy </w:t>
-      </w:r>
-      <w:r>
-        <w:rPr>
-          <w:rFonts w:ascii="Times New Roman" w:cs="Times New Roman" w:eastAsia="Times New Roman" w:hAnsi="Times New Roman"/>
-          <w:rtl w:val="0"/>
-        </w:rPr>
-        <w:t xml:space="preserve">hoặc mysql local đã cài đang chạy</w:t>
-      </w:r>
-      <w:r>
-        <w:rPr>
-          <w:rFonts w:ascii="Times New Roman" w:cs="Times New Roman" w:eastAsia="Times New Roman" w:hAnsi="Times New Roman"/>
-          <w:b w:val="0"/>
-          <w:bCs w:val="0"/>
-          <w:i w:val="0"/>
-          <w:iCs w:val="0"/>
-          <w:smallCaps w:val="0"/>
-          <w:strike w:val="0"/>
-          <w:color w:val="000000"/>
-          <w:sz w:val="22"/>
-          <w:szCs w:val="22"/>
-          <w:u w:val="none"/>
-          <w:shd w:fill="auto" w:val="clear"/>
-          <w:vertAlign w:val="baseline"/>
-          <w:rtl w:val="0"/>
-        </w:rPr>
-        <w:t xml:space="preserve">.</w:t>
-      </w:r>
-      <w:r>
-        <w:rPr>
-          <w:rtl w:val="0"/>
-        </w:rPr>
+        <w:t>Trong XAMPP cần bật cả Apache và MySQL trước khi thao tác.</w:t>
       </w:r>
     </w:p>
     <w:p>
@@ -2720,34 +2626,7 @@
         <w:rPr/>
       </w:pPr>
       <w:r>
-        <w:rPr>
-          <w:rFonts w:ascii="Times New Roman" w:cs="Times New Roman" w:eastAsia="Times New Roman" w:hAnsi="Times New Roman"/>
-          <w:sz w:val="22"/>
-          <w:szCs w:val="22"/>
-          <w:rtl w:val="0"/>
-        </w:rPr>
-        <w:t xml:space="preserve">Phương án này phù hợp khi máy Windows đã có XAMPP </w:t>
-      </w:r>
-      <w:r>
-        <w:rPr>
-          <w:rFonts w:ascii="Times New Roman" w:cs="Times New Roman" w:eastAsia="Times New Roman" w:hAnsi="Times New Roman"/>
-          <w:rtl w:val="0"/>
-        </w:rPr>
-        <w:t xml:space="preserve">hoặc mysql local đã cài trên máy</w:t>
-      </w:r>
-      <w:r>
-        <w:rPr>
-          <w:rFonts w:ascii="Times New Roman" w:cs="Times New Roman" w:eastAsia="Times New Roman" w:hAnsi="Times New Roman"/>
-          <w:sz w:val="22"/>
-          <w:szCs w:val="22"/>
-          <w:rtl w:val="0"/>
-        </w:rPr>
-        <w:t xml:space="preserve">.</w:t>
-      </w:r>
-      <w:r>
-        <w:rPr>
-          <w:rtl w:val="0"/>
-        </w:rPr>
+        <w:t>Phương án này phù hợp khi máy Windows dùng XAMPP để quản lý MySQL và phpMyAdmin.</w:t>
       </w:r>
     </w:p>
     <w:p>
@@ -2822,28 +2701,7 @@
         <w:rPr/>
       </w:pPr>
       <w:r>
-        <w:rPr>
-          <w:rFonts w:ascii="Times New Roman" w:cs="Times New Roman" w:eastAsia="Times New Roman" w:hAnsi="Times New Roman"/>
-          <w:b w:val="0"/>
-          <w:bCs w:val="0"/>
-          <w:i w:val="0"/>
-          <w:iCs w:val="0"/>
-          <w:smallCaps w:val="0"/>
-          <w:strike w:val="0"/>
-          <w:color w:val="000000"/>
-          <w:sz w:val="22"/>
-          <w:szCs w:val="22"/>
-          <w:u w:val="none"/>
-          <w:shd w:fill="auto" w:val="clear"/>
-          <w:vertAlign w:val="baseline"/>
-          <w:rtl w:val="0"/>
-        </w:rPr>
-        <w:t xml:space="preserve">Cài XAMPP, mở XAMPP Control Panel và Start dịch vụ MySQL.</w:t>
-      </w:r>
-      <w:r>
-        <w:rPr>
-          <w:rtl w:val="0"/>
-        </w:rPr>
+        <w:t>Cài XAMPP, mở XAMPP Control Panel và Start cả Apache lẫn MySQL.</w:t>
       </w:r>
     </w:p>
     <w:p>
@@ -3128,16 +2986,7 @@
         <w:rPr/>
       </w:pPr>
       <w:r>
-        <w:rPr>
-          <w:rFonts w:ascii="Times New Roman" w:cs="Times New Roman" w:eastAsia="Times New Roman" w:hAnsi="Times New Roman"/>
-          <w:rtl w:val="0"/>
-        </w:rPr>
-        <w:t xml:space="preserve">Mở Command Prompt tại thư mục bài tập cá nhân và chạy lệnh: cd be</w:t>
-      </w:r>
-      <w:r>
-        <w:rPr>
-          <w:rtl w:val="0"/>
-        </w:rPr>
+        <w:t>Mở Command Prompt hoặc PowerShell tại thư mục bài tập cá nhân, sau đó chạy lệnh: cd be</w:t>
       </w:r>
     </w:p>
     <w:p>
@@ -3164,28 +3013,7 @@
         <w:rPr/>
       </w:pPr>
       <w:r>
-        <w:rPr>
-          <w:rFonts w:ascii="Times New Roman" w:cs="Times New Roman" w:eastAsia="Times New Roman" w:hAnsi="Times New Roman"/>
-          <w:b w:val="0"/>
-          <w:bCs w:val="0"/>
-          <w:i w:val="0"/>
-          <w:iCs w:val="0"/>
-          <w:smallCaps w:val="0"/>
-          <w:strike w:val="0"/>
-          <w:color w:val="000000"/>
-          <w:sz w:val="22"/>
-          <w:szCs w:val="22"/>
-          <w:u w:val="none"/>
-          <w:shd w:fill="auto" w:val="clear"/>
-          <w:vertAlign w:val="baseline"/>
-          <w:rtl w:val="0"/>
-        </w:rPr>
-        <w:t xml:space="preserve">Nạp dữ liệu mẫu bằng lệnh: mysql -u staffmanager -pstaffmanager staffmanager &lt; sql\schema.sql</w:t>
-      </w:r>
-      <w:r>
-        <w:rPr>
-          <w:rtl w:val="0"/>
-        </w:rPr>
+        <w:t>Nạp dữ liệu mẫu bằng lệnh: mysql -u root staffmanager &lt; sql\schema.sql</w:t>
       </w:r>
     </w:p>
     <w:p>
@@ -3212,28 +3040,7 @@
         <w:rPr/>
       </w:pPr>
       <w:r>
-        <w:rPr>
-          <w:rFonts w:ascii="Times New Roman" w:cs="Times New Roman" w:eastAsia="Times New Roman" w:hAnsi="Times New Roman"/>
-          <w:b w:val="0"/>
-          <w:bCs w:val="0"/>
-          <w:i w:val="0"/>
-          <w:iCs w:val="0"/>
-          <w:smallCaps w:val="0"/>
-          <w:strike w:val="0"/>
-          <w:color w:val="000000"/>
-          <w:sz w:val="22"/>
-          <w:szCs w:val="22"/>
-          <w:u w:val="none"/>
-          <w:shd w:fill="auto" w:val="clear"/>
-          <w:vertAlign w:val="baseline"/>
-          <w:rtl w:val="0"/>
-        </w:rPr>
-        <w:t xml:space="preserve">Chạy ứng dụng bằng lệnh: gradlew.bat run</w:t>
-      </w:r>
-      <w:r>
-        <w:rPr>
-          <w:rtl w:val="0"/>
-        </w:rPr>
+        <w:t>Chạy ứng dụng bằng lệnh: .\gradlew.bat run nếu dùng PowerShell, hoặc gradlew.bat run nếu dùng Command Prompt</w:t>
       </w:r>
     </w:p>
     <w:p>
@@ -3336,28 +3143,7 @@
         <w:rPr/>
       </w:pPr>
       <w:r>
-        <w:rPr>
-          <w:rFonts w:ascii="Times New Roman" w:cs="Times New Roman" w:eastAsia="Times New Roman" w:hAnsi="Times New Roman"/>
-          <w:b w:val="0"/>
-          <w:bCs w:val="0"/>
-          <w:i w:val="0"/>
-          <w:iCs w:val="0"/>
-          <w:smallCaps w:val="0"/>
-          <w:strike w:val="0"/>
-          <w:color w:val="000000"/>
-          <w:sz w:val="22"/>
-          <w:szCs w:val="22"/>
-          <w:u w:val="none"/>
-          <w:shd w:fill="auto" w:val="clear"/>
-          <w:vertAlign w:val="baseline"/>
-          <w:rtl w:val="0"/>
-        </w:rPr>
-        <w:t xml:space="preserve">Username: staffmanager</w:t>
-      </w:r>
-      <w:r>
-        <w:rPr>
-          <w:rtl w:val="0"/>
-        </w:rPr>
+        <w:t>Username mặc định của XAMPP: root</w:t>
       </w:r>
     </w:p>
     <w:p>
@@ -3384,28 +3170,7 @@
         <w:rPr/>
       </w:pPr>
       <w:r>
-        <w:rPr>
-          <w:rFonts w:ascii="Times New Roman" w:cs="Times New Roman" w:eastAsia="Times New Roman" w:hAnsi="Times New Roman"/>
-          <w:b w:val="0"/>
-          <w:bCs w:val="0"/>
-          <w:i w:val="0"/>
-          <w:iCs w:val="0"/>
-          <w:smallCaps w:val="0"/>
-          <w:strike w:val="0"/>
-          <w:color w:val="000000"/>
-          <w:sz w:val="22"/>
-          <w:szCs w:val="22"/>
-          <w:u w:val="none"/>
-          <w:shd w:fill="auto" w:val="clear"/>
-          <w:vertAlign w:val="baseline"/>
-          <w:rtl w:val="0"/>
-        </w:rPr>
-        <w:t xml:space="preserve">Password: staffmanager</w:t>
-      </w:r>
-      <w:r>
-        <w:rPr>
-          <w:rtl w:val="0"/>
-        </w:rPr>
+        <w:t>Password mặc định của XAMPP: để trống</w:t>
       </w:r>
     </w:p>
     <w:p>

</xml_diff>